<commit_message>
feat: implement interactive Decision Support System dashboard and add presentation slide documentation
</commit_message>
<xml_diff>
--- a/dthesis.docx
+++ b/dthesis.docx
@@ -15865,7 +15865,33 @@
         <w:pStyle w:val="FirstParagraph"/>
       </w:pPr>
       <w:r>
-        <w:t xml:space="preserve">A Streamlit dashboard provides interactive trade-off visualisation:</w:t>
+        <w:t xml:space="preserve">A Streamlit-based interactive Decision Support System (DSS) was developed to enable stakeholders to explore optimisation results without requiring programming expertise. The dashboard is deployed on Streamlit Community Cloud and accessible at:</w:t>
+      </w:r>
+    </w:p>
+    <w:p>
+      <w:pPr>
+        <w:pStyle w:val="BlockText"/>
+      </w:pPr>
+      <w:r>
+        <w:rPr>
+          <w:b/>
+          <w:bCs/>
+        </w:rPr>
+        <w:t xml:space="preserve">Live Dashboard:</w:t>
+      </w:r>
+      <w:r>
+        <w:t xml:space="preserve"> </w:t>
+      </w:r>
+      <w:r>
+        <w:t xml:space="preserve">https://sagar2664-mtp.streamlit.app</w:t>
+      </w:r>
+    </w:p>
+    <w:p>
+      <w:pPr>
+        <w:pStyle w:val="FirstParagraph"/>
+      </w:pPr>
+      <w:r>
+        <w:t xml:space="preserve">The DSS provides four modules:</w:t>
       </w:r>
     </w:p>
     <w:p>
@@ -15877,7 +15903,17 @@
         </w:numPr>
       </w:pPr>
       <w:r>
-        <w:t xml:space="preserve">Geographic network map with mode-coloured flow arcs</w:t>
+        <w:rPr>
+          <w:b/>
+          <w:bCs/>
+        </w:rPr>
+        <w:t xml:space="preserve">Overview</w:t>
+      </w:r>
+      <w:r>
+        <w:t xml:space="preserve"> </w:t>
+      </w:r>
+      <w:r>
+        <w:t xml:space="preserve">— KPI cards, convergence plots, and summary statistics for the optimisation run.</w:t>
       </w:r>
     </w:p>
     <w:p>
@@ -15889,7 +15925,17 @@
         </w:numPr>
       </w:pPr>
       <w:r>
-        <w:t xml:space="preserve">Interactive 3D Pareto front with highlighted representative solutions</w:t>
+        <w:rPr>
+          <w:b/>
+          <w:bCs/>
+        </w:rPr>
+        <w:t xml:space="preserve">Network Map</w:t>
+      </w:r>
+      <w:r>
+        <w:t xml:space="preserve"> </w:t>
+      </w:r>
+      <w:r>
+        <w:t xml:space="preserve">— Geographic visualisation of the supply chain with mode-coloured flow arcs (blue: rail, green: road). Users can switch between representative solutions to observe how flow patterns change across the Pareto front.</w:t>
       </w:r>
     </w:p>
     <w:p>
@@ -15901,7 +15947,17 @@
         </w:numPr>
       </w:pPr>
       <w:r>
-        <w:t xml:space="preserve">Sankey flow diagrams, sunburst mode-share charts, and radar comparisons</w:t>
+        <w:rPr>
+          <w:b/>
+          <w:bCs/>
+        </w:rPr>
+        <w:t xml:space="preserve">Pareto Analysis</w:t>
+      </w:r>
+      <w:r>
+        <w:t xml:space="preserve"> </w:t>
+      </w:r>
+      <w:r>
+        <w:t xml:space="preserve">— Interactive 3D scatter plot of the Pareto front with cost, emissions, and resilience axes. Includes bar charts, radar comparisons, and solution filtering.</w:t>
       </w:r>
     </w:p>
     <w:p>
@@ -15913,7 +15969,25 @@
         </w:numPr>
       </w:pPr>
       <w:r>
-        <w:t xml:space="preserve">Simulation gauge indicators and parameter tables</w:t>
+        <w:rPr>
+          <w:b/>
+          <w:bCs/>
+        </w:rPr>
+        <w:t xml:space="preserve">Resilience Simulation</w:t>
+      </w:r>
+      <w:r>
+        <w:t xml:space="preserve"> </w:t>
+      </w:r>
+      <w:r>
+        <w:t xml:space="preserve">— Gauge indicators for average fill rate, worst-case fill rate, and disruption frequency from the Monte Carlo simulation.</w:t>
+      </w:r>
+    </w:p>
+    <w:p>
+      <w:pPr>
+        <w:pStyle w:val="FirstParagraph"/>
+      </w:pPr>
+      <w:r>
+        <w:t xml:space="preserve">The source code is publicly available at: https://github.com/sagar2664/mtp</w:t>
       </w:r>
     </w:p>
     <w:bookmarkEnd w:id="64"/>
@@ -18509,6 +18583,42 @@
           <w:b/>
           <w:bCs/>
         </w:rPr>
+        <w:t xml:space="preserve">Source Code Repository:</w:t>
+      </w:r>
+      <w:r>
+        <w:t xml:space="preserve"> </w:t>
+      </w:r>
+      <w:r>
+        <w:t xml:space="preserve">https://github.com/sagar2664/mtp</w:t>
+      </w:r>
+    </w:p>
+    <w:p>
+      <w:pPr>
+        <w:pStyle w:val="BodyText"/>
+      </w:pPr>
+      <w:r>
+        <w:rPr>
+          <w:b/>
+          <w:bCs/>
+        </w:rPr>
+        <w:t xml:space="preserve">Live Dashboard:</w:t>
+      </w:r>
+      <w:r>
+        <w:t xml:space="preserve"> </w:t>
+      </w:r>
+      <w:r>
+        <w:t xml:space="preserve">https://sagar2664-mtp.streamlit.app</w:t>
+      </w:r>
+    </w:p>
+    <w:p>
+      <w:pPr>
+        <w:pStyle w:val="BodyText"/>
+      </w:pPr>
+      <w:r>
+        <w:rPr>
+          <w:b/>
+          <w:bCs/>
+        </w:rPr>
         <w:t xml:space="preserve">Reproducing results:</w:t>
       </w:r>
     </w:p>
@@ -18520,7 +18630,7 @@
         <w:rPr>
           <w:rStyle w:val="VerbatimChar"/>
         </w:rPr>
-        <w:t xml:space="preserve">pip install pyomo pymoo scikit-learn simpy streamlit pandas numpy geopy plotly</w:t>
+        <w:t xml:space="preserve">pip install -r requirements.txt</w:t>
       </w:r>
       <w:r>
         <w:br/>
@@ -19849,7 +19959,34 @@
     </w:lvlOverride>
   </w:num>
   <w:num w:numId="1012">
-    <w:abstractNumId w:val="991"/>
+    <w:abstractNumId w:val="99411"/>
+    <w:lvlOverride w:ilvl="0">
+      <w:startOverride w:val="1"/>
+    </w:lvlOverride>
+    <w:lvlOverride w:ilvl="1">
+      <w:startOverride w:val="1"/>
+    </w:lvlOverride>
+    <w:lvlOverride w:ilvl="2">
+      <w:startOverride w:val="1"/>
+    </w:lvlOverride>
+    <w:lvlOverride w:ilvl="3">
+      <w:startOverride w:val="1"/>
+    </w:lvlOverride>
+    <w:lvlOverride w:ilvl="4">
+      <w:startOverride w:val="1"/>
+    </w:lvlOverride>
+    <w:lvlOverride w:ilvl="5">
+      <w:startOverride w:val="1"/>
+    </w:lvlOverride>
+    <w:lvlOverride w:ilvl="6">
+      <w:startOverride w:val="1"/>
+    </w:lvlOverride>
+    <w:lvlOverride w:ilvl="7">
+      <w:startOverride w:val="1"/>
+    </w:lvlOverride>
+    <w:lvlOverride w:ilvl="8">
+      <w:startOverride w:val="1"/>
+    </w:lvlOverride>
   </w:num>
   <w:num w:numId="1013">
     <w:abstractNumId w:val="99411"/>

</xml_diff>